<commit_message>
Add module authorization and reorganize docs
</commit_message>
<xml_diff>
--- a/docs/0. Desarrollo de Sistema de Gestión de Riesgos 2024-Agosto.docx
+++ b/docs/0. Desarrollo de Sistema de Gestión de Riesgos 2024-Agosto.docx
@@ -1174,6 +1174,8 @@
         </w:rPr>
         <w:t>Módulo de Indicadores de Riesgos</w:t>
       </w:r>
+      <w:bookmarkStart w:id="0" w:name="_GoBack"/>
+      <w:bookmarkEnd w:id="0"/>
     </w:p>
     <w:p>
       <w:pPr>
@@ -1663,7 +1665,6 @@
           <w:lang w:val="es-ES"/>
         </w:rPr>
       </w:pPr>
-      <w:bookmarkStart w:id="0" w:name="_GoBack"/>
       <w:r>
         <w:rPr>
           <w:rFonts w:cstheme="minorHAnsi"/>
@@ -1742,7 +1743,6 @@
           </mc:Fallback>
         </mc:AlternateContent>
       </w:r>
-      <w:bookmarkEnd w:id="0"/>
       <w:r>
         <w:rPr>
           <w:rFonts w:cstheme="minorHAnsi"/>
@@ -3338,12 +3338,11 @@
           <w:szCs w:val="20"/>
           <w:lang w:val="es-ES"/>
         </w:rPr>
-        <w:t xml:space="preserve">… </w:t>
-      </w:r>
-    </w:p>
-    <w:p>
-      <w:pPr>
-        <w:jc w:val="both"/>
+        <w:t>.</w:t>
+      </w:r>
+    </w:p>
+    <w:p>
+      <w:pPr>
         <w:rPr>
           <w:rFonts w:cstheme="minorHAnsi"/>
           <w:b/>
@@ -3352,6 +3351,16 @@
           <w:lang w:val="es-ES"/>
         </w:rPr>
       </w:pPr>
+      <w:r>
+        <w:rPr>
+          <w:rFonts w:cstheme="minorHAnsi"/>
+          <w:b/>
+          <w:sz w:val="20"/>
+          <w:szCs w:val="20"/>
+          <w:lang w:val="es-ES"/>
+        </w:rPr>
+        <w:br w:type="page"/>
+      </w:r>
     </w:p>
     <w:p>
       <w:pPr>
@@ -3379,6 +3388,7 @@
           <w:u w:val="single"/>
           <w:lang w:val="es-ES"/>
         </w:rPr>
+        <w:lastRenderedPageBreak/>
         <w:t>MÓDULO DE MATRICES DE RIESGOS</w:t>
       </w:r>
       <w:r>
@@ -3680,7 +3690,6 @@
           <w:u w:val="single"/>
           <w:lang w:val="es-ES"/>
         </w:rPr>
-        <w:lastRenderedPageBreak/>
         <w:t>Segunda parte</w:t>
       </w:r>
       <w:r>
@@ -4017,6 +4026,7 @@
           <w:szCs w:val="20"/>
           <w:lang w:eastAsia="es-HN"/>
         </w:rPr>
+        <w:lastRenderedPageBreak/>
         <w:drawing>
           <wp:inline distT="0" distB="0" distL="0" distR="0" wp14:anchorId="016533EB" wp14:editId="228577FE">
             <wp:extent cx="6001468" cy="3491345"/>
@@ -4172,7 +4182,6 @@
           <w:szCs w:val="20"/>
           <w:lang w:eastAsia="es-HN"/>
         </w:rPr>
-        <w:lastRenderedPageBreak/>
         <w:drawing>
           <wp:inline distT="0" distB="0" distL="0" distR="0">
             <wp:extent cx="6007765" cy="3485407"/>
@@ -4337,6 +4346,7 @@
           <w:szCs w:val="20"/>
           <w:lang w:val="es-ES"/>
         </w:rPr>
+        <w:lastRenderedPageBreak/>
         <w:t>Son en general 3 factores de riesgo: Cliente</w:t>
       </w:r>
       <w:r>
@@ -4634,7 +4644,6 @@
           <w:szCs w:val="20"/>
           <w:lang w:eastAsia="es-HN"/>
         </w:rPr>
-        <w:lastRenderedPageBreak/>
         <w:drawing>
           <wp:inline distT="0" distB="0" distL="0" distR="0" wp14:anchorId="7D3B9C91">
             <wp:extent cx="3737113" cy="2605540"/>
@@ -4995,6 +5004,7 @@
           <w:sz w:val="20"/>
           <w:szCs w:val="20"/>
         </w:rPr>
+        <w:lastRenderedPageBreak/>
         <w:t>En esta matriz debería vaciarse la explotación de datos del sistema, eso significa que debe depositarse los resultados de las variables aplicadas a cada patrono:</w:t>
       </w:r>
     </w:p>
@@ -5052,7 +5062,6 @@
           <w:szCs w:val="20"/>
           <w:lang w:eastAsia="es-HN"/>
         </w:rPr>
-        <w:lastRenderedPageBreak/>
         <w:drawing>
           <wp:inline distT="0" distB="0" distL="0" distR="0" wp14:anchorId="1EB0B374" wp14:editId="7BE136C3">
             <wp:extent cx="3140765" cy="1855275"/>
@@ -5582,7 +5591,6 @@
           <w:szCs w:val="20"/>
           <w:lang w:val="es-ES"/>
         </w:rPr>
-        <w:lastRenderedPageBreak/>
         <w:t>Debe mostrarse actual, desde hasta, o a cierta fecha en particular.</w:t>
       </w:r>
     </w:p>
@@ -6244,14 +6252,23 @@
     </w:p>
     <w:p>
       <w:pPr>
-        <w:jc w:val="both"/>
-        <w:rPr>
-          <w:rFonts w:cstheme="minorHAnsi"/>
-          <w:sz w:val="20"/>
-          <w:szCs w:val="20"/>
-          <w:lang w:val="es-ES"/>
-        </w:rPr>
-      </w:pPr>
+        <w:rPr>
+          <w:rFonts w:cstheme="minorHAnsi"/>
+          <w:sz w:val="20"/>
+          <w:szCs w:val="20"/>
+          <w:lang w:val="es-ES"/>
+        </w:rPr>
+      </w:pPr>
+      <w:r>
+        <w:rPr>
+          <w:rFonts w:cstheme="minorHAnsi"/>
+          <w:sz w:val="20"/>
+          <w:szCs w:val="20"/>
+          <w:lang w:val="es-ES"/>
+        </w:rPr>
+        <w:lastRenderedPageBreak/>
+        <w:br w:type="page"/>
+      </w:r>
     </w:p>
     <w:p>
       <w:pPr>
@@ -6279,6 +6296,7 @@
           <w:u w:val="single"/>
           <w:lang w:val="es-ES"/>
         </w:rPr>
+        <w:lastRenderedPageBreak/>
         <w:t xml:space="preserve">MÓDULO DE DEBIDA DILIGENCIA INVERSIONES </w:t>
       </w:r>
     </w:p>
@@ -6299,7 +6317,6 @@
           <w:szCs w:val="20"/>
           <w:lang w:val="es-ES"/>
         </w:rPr>
-        <w:lastRenderedPageBreak/>
         <w:t xml:space="preserve">Este módulo debe ser manejado como lo detallado en Modulo de Monitoreo de Listas, en donde se pueda identificar la empresa </w:t>
       </w:r>
       <w:r>
@@ -8378,42 +8395,6 @@
     </w:p>
     <w:p>
       <w:pPr>
-        <w:jc w:val="both"/>
-        <w:rPr>
-          <w:rFonts w:cstheme="minorHAnsi"/>
-          <w:lang w:val="es-ES"/>
-        </w:rPr>
-      </w:pPr>
-    </w:p>
-    <w:p>
-      <w:pPr>
-        <w:jc w:val="both"/>
-        <w:rPr>
-          <w:rFonts w:cstheme="minorHAnsi"/>
-          <w:lang w:val="es-ES"/>
-        </w:rPr>
-      </w:pPr>
-    </w:p>
-    <w:p>
-      <w:pPr>
-        <w:jc w:val="both"/>
-        <w:rPr>
-          <w:rFonts w:cstheme="minorHAnsi"/>
-          <w:lang w:val="es-ES"/>
-        </w:rPr>
-      </w:pPr>
-    </w:p>
-    <w:p>
-      <w:pPr>
-        <w:jc w:val="both"/>
-        <w:rPr>
-          <w:rFonts w:cstheme="minorHAnsi"/>
-          <w:lang w:val="es-ES"/>
-        </w:rPr>
-      </w:pPr>
-    </w:p>
-    <w:p>
-      <w:pPr>
         <w:jc w:val="center"/>
         <w:rPr>
           <w:rFonts w:cstheme="minorHAnsi"/>
@@ -8501,7 +8482,7 @@
             <w:noProof/>
             <w:lang w:val="es-ES"/>
           </w:rPr>
-          <w:t>2</w:t>
+          <w:t>8</w:t>
         </w:r>
         <w:r>
           <w:fldChar w:fldCharType="end"/>
@@ -8565,7 +8546,7 @@
         <v:path o:extrusionok="f" gradientshapeok="t" o:connecttype="rect"/>
         <o:lock v:ext="edit" aspectratio="t"/>
       </v:shapetype>
-      <v:shape id="_x0000_i1029" type="#_x0000_t75" style="width:11.7pt;height:11.7pt" o:bullet="t">
+      <v:shape id="_x0000_i1031" type="#_x0000_t75" style="width:11.85pt;height:11.85pt" o:bullet="t">
         <v:imagedata r:id="rId1" o:title="mso119"/>
       </v:shape>
     </w:pict>

</xml_diff>